<commit_message>
Add Privacy Policy & Terms page and navigation links
</commit_message>
<xml_diff>
--- a/Features.docx
+++ b/Features.docx
@@ -64,25 +64,13 @@
         <w:t>Auditors</w:t>
       </w:r>
       <w:r>
-        <w:t xml:space="preserve"> can add notes against the inquiries and any additional notes against the </w:t>
-      </w:r>
-      <w:r>
-        <w:t>Assessments/Inquiries</w:t>
-      </w:r>
-      <w:r>
-        <w:t xml:space="preserve"> which then be exported to the report. Report clearly defines the hierarchy between Schema </w:t>
+        <w:t xml:space="preserve"> can add notes against the inquiries and any additional notes against the Assessments/Inquiries which then be exported to the report. Report clearly defines the hierarchy between Schema </w:t>
       </w:r>
       <w:r>
         <w:t>areas,</w:t>
       </w:r>
       <w:r>
-        <w:t xml:space="preserve"> </w:t>
-      </w:r>
-      <w:r>
-        <w:t>inquiries/assessment/queries</w:t>
-      </w:r>
-      <w:r>
-        <w:t xml:space="preserve"> and notes/additional notes</w:t>
+        <w:t xml:space="preserve"> inquiries/assessment/queries and notes/additional notes</w:t>
       </w:r>
     </w:p>
     <w:p>
@@ -330,7 +318,7 @@
       </w:pPr>
       <w:r>
         <w:pict w14:anchorId="0E9B5660">
-          <v:rect id="_x0000_i1049" style="width:0;height:1.5pt" o:hralign="center" o:hrstd="t" o:hrnoshade="t" o:hr="t" fillcolor="gray" stroked="f"/>
+          <v:rect id="_x0000_i1025" style="width:0;height:1.5pt" o:hralign="center" o:hrstd="t" o:hrnoshade="t" o:hr="t" fillcolor="gray" stroked="f"/>
         </w:pict>
       </w:r>
     </w:p>
@@ -406,13 +394,7 @@
         <w:t>Total Data Ownership:</w:t>
       </w:r>
       <w:r>
-        <w:t xml:space="preserve"> Even if the application needs </w:t>
-      </w:r>
-      <w:r>
-        <w:t>reinstallation</w:t>
-      </w:r>
-      <w:r>
-        <w:t>, your data remains in your possession. You are never locked out of your own work.</w:t>
+        <w:t xml:space="preserve"> Even if the application needs reinstallation, your data remains in your possession. You are never locked out of your own work.</w:t>
       </w:r>
     </w:p>
     <w:p>
@@ -496,7 +478,7 @@
       </w:pPr>
       <w:r>
         <w:pict w14:anchorId="784D673B">
-          <v:rect id="_x0000_i1050" style="width:0;height:1.5pt" o:hralign="center" o:hrstd="t" o:hrnoshade="t" o:hr="t" fillcolor="gray" stroked="f"/>
+          <v:rect id="_x0000_i1026" style="width:0;height:1.5pt" o:hralign="center" o:hrstd="t" o:hrnoshade="t" o:hr="t" fillcolor="gray" stroked="f"/>
         </w:pict>
       </w:r>
     </w:p>
@@ -647,7 +629,7 @@
       </w:pPr>
       <w:r>
         <w:pict w14:anchorId="4C7E31C7">
-          <v:rect id="_x0000_i1051" style="width:0;height:1.5pt" o:hralign="center" o:hrstd="t" o:hrnoshade="t" o:hr="t" fillcolor="gray" stroked="f"/>
+          <v:rect id="_x0000_i1027" style="width:0;height:1.5pt" o:hralign="center" o:hrstd="t" o:hrnoshade="t" o:hr="t" fillcolor="gray" stroked="f"/>
         </w:pict>
       </w:r>
     </w:p>
@@ -766,7 +748,7 @@
       </w:pPr>
       <w:r>
         <w:pict w14:anchorId="20487623">
-          <v:rect id="_x0000_i1052" style="width:0;height:1.5pt" o:hralign="center" o:hrstd="t" o:hrnoshade="t" o:hr="t" fillcolor="gray" stroked="f"/>
+          <v:rect id="_x0000_i1028" style="width:0;height:1.5pt" o:hralign="center" o:hrstd="t" o:hrnoshade="t" o:hr="t" fillcolor="gray" stroked="f"/>
         </w:pict>
       </w:r>
     </w:p>
@@ -2154,6 +2136,7 @@
   <w:style w:type="character" w:default="1" w:styleId="DefaultParagraphFont">
     <w:name w:val="Default Paragraph Font"/>
     <w:uiPriority w:val="1"/>
+    <w:semiHidden/>
     <w:unhideWhenUsed/>
   </w:style>
   <w:style w:type="table" w:default="1" w:styleId="TableNormal">

</xml_diff>